<commit_message>
Restructure operator equity: 4.9% vested base earning up to 13.3%
Split each operator's 13.3% Restricted Interest into a 4.9% Initial
Vested Base (vested at the Effective Date, reflecting their original
interest) and an 8.4% Earn-Up Portion subject to dual-trigger
(time + performance) vesting. Keeps each operator issued/outstanding
at 13.3% so Bullard stays at 19.5% (under the SBA 20% guaranty
threshold), while reflecting 'start at 4.9%, earn up to 13.3%'
throughout the OA Amendment No. 1 and narrative documents.
</commit_message>
<xml_diff>
--- a/sba_application/02_use_of_funds/Equity_Injection_and_SBA_Structure_MEMO.docx
+++ b/sba_application/02_use_of_funds/Equity_Injection_and_SBA_Structure_MEMO.docx
@@ -1059,7 +1059,7 @@
               <w:rPr>
                 <w:sz w:val="19"/>
               </w:rPr>
-              <w:t>13.3% (4-yr vest, 1-yr cliff)</w:t>
+              <w:t>13.3% (4.9% vested base; earn-up to 13.3%)</w:t>
             </w:r>
           </w:p>
         </w:tc>
@@ -1117,7 +1117,7 @@
               <w:rPr>
                 <w:sz w:val="19"/>
               </w:rPr>
-              <w:t>13.3% (4-yr vest, 1-yr cliff)</w:t>
+              <w:t>13.3% (4.9% vested base; earn-up to 13.3%)</w:t>
             </w:r>
           </w:p>
         </w:tc>
@@ -1175,7 +1175,7 @@
               <w:rPr>
                 <w:sz w:val="19"/>
               </w:rPr>
-              <w:t>13.3% (4-yr vest, 1-yr cliff)</w:t>
+              <w:t>13.3% (4.9% vested base; earn-up to 13.3%)</w:t>
             </w:r>
           </w:p>
         </w:tc>

</xml_diff>

<commit_message>
Make full 13.3% operator Restricted Interest forfeitable
Convert the 4.9% Initial Base from vested-at-grant/callable into a
time-vesting, forfeitable component (four-year schedule, one-year
cliff, continuous service alone; no performance milestone). The 8.4%
Earn-Up Portion keeps its dual trigger. No portion of the 13.3% is
vested at the Effective Date, so the entire interest is at risk and
forfeited at $0 on early departure. Updates OA Amendment No. 1 Sec 4,
recitals, Exhibit A note, signature blocks, and all narrative/cap-table
references across the package.

https://claude.ai/code/session_01GAHLyfqLR9bxwN2jm6VjPU
</commit_message>
<xml_diff>
--- a/sba_application/02_use_of_funds/Equity_Injection_and_SBA_Structure_MEMO.docx
+++ b/sba_application/02_use_of_funds/Equity_Injection_and_SBA_Structure_MEMO.docx
@@ -1059,7 +1059,7 @@
               <w:rPr>
                 <w:sz w:val="19"/>
               </w:rPr>
-              <w:t>13.3% (4.9% vested base; earn-up to 13.3%)</w:t>
+              <w:t>13.3% (fully forfeitable; 4-yr vest, 1-yr cliff)</w:t>
             </w:r>
           </w:p>
         </w:tc>
@@ -1117,7 +1117,7 @@
               <w:rPr>
                 <w:sz w:val="19"/>
               </w:rPr>
-              <w:t>13.3% (4.9% vested base; earn-up to 13.3%)</w:t>
+              <w:t>13.3% (fully forfeitable; 4-yr vest, 1-yr cliff)</w:t>
             </w:r>
           </w:p>
         </w:tc>
@@ -1175,7 +1175,7 @@
               <w:rPr>
                 <w:sz w:val="19"/>
               </w:rPr>
-              <w:t>13.3% (4.9% vested base; earn-up to 13.3%)</w:t>
+              <w:t>13.3% (fully forfeitable; 4-yr vest, 1-yr cliff)</w:t>
             </w:r>
           </w:p>
         </w:tc>

</xml_diff>

<commit_message>
QA + commit package-wide narrative rebuild to dual-debt structure
Narrative agent rebuilt all SBA narratives to: SBA $450K + bank $300K (6%/3yr,
subordinate, J. Bullard PG) + equity $195K = $945K; DSCR 1.79x/4.02x/5.95x.

QA fixes applied on top of the agent's work:
- Fixed 3 stale 'Tyler Hospice HoldCo' entity names missed across line-breaks
- Corrected hallucinated seller name 'Greiner' -> Gleason/Lozano
- Reframed package so the A&R OA is operative (supersedes interim Amendment No. 1);
  marked the Amendment doc SUPERSEDED; updated TOC/closing-checklist/tracker
- Resolved entity open-item B2 (Wyoming; amend MIPA buyer); B3 -> execute A&R + Hickory OA
- Verified: build clean, 0 stale tokens, 0 stale entity names, numbers tie out

https://claude.ai/code/session_01GAHLyfqLR9bxwN2jm6VjPU
</commit_message>
<xml_diff>
--- a/sba_application/02_use_of_funds/Equity_Injection_and_SBA_Structure_MEMO.docx
+++ b/sba_application/02_use_of_funds/Equity_Injection_and_SBA_Structure_MEMO.docx
@@ -138,7 +138,7 @@
               <w:rPr>
                 <w:sz w:val="19"/>
               </w:rPr>
-              <w:t>SBA 7(a) loan</w:t>
+              <w:t>SBA 7(a) loan (startup + working capital)</w:t>
             </w:r>
           </w:p>
         </w:tc>
@@ -152,7 +152,7 @@
               <w:rPr>
                 <w:sz w:val="19"/>
               </w:rPr>
-              <w:t>$555,000</w:t>
+              <w:t>$450,000</w:t>
             </w:r>
           </w:p>
         </w:tc>
@@ -166,7 +166,7 @@
               <w:rPr>
                 <w:sz w:val="19"/>
               </w:rPr>
-              <w:t>74.0%</w:t>
+              <w:t>47.6%</w:t>
             </w:r>
           </w:p>
         </w:tc>
@@ -180,7 +180,65 @@
               <w:rPr>
                 <w:sz w:val="19"/>
               </w:rPr>
-              <w:t>Senior debt (only debt the business carries)</w:t>
+              <w:t>Senior debt; 15-yr term, ~10.5%</w:t>
+            </w:r>
+          </w:p>
+        </w:tc>
+      </w:tr>
+      <w:tr>
+        <w:tc>
+          <w:tcPr>
+            <w:tcW w:type="dxa" w:w="4608"/>
+          </w:tcPr>
+          <w:p>
+            <w:r/>
+            <w:r>
+              <w:rPr>
+                <w:sz w:val="19"/>
+              </w:rPr>
+              <w:t>Bank acquisition term loan (Hickory purchase)</w:t>
+            </w:r>
+          </w:p>
+        </w:tc>
+        <w:tc>
+          <w:tcPr>
+            <w:tcW w:type="dxa" w:w="1584"/>
+          </w:tcPr>
+          <w:p>
+            <w:r/>
+            <w:r>
+              <w:rPr>
+                <w:sz w:val="19"/>
+              </w:rPr>
+              <w:t>$300,000</w:t>
+            </w:r>
+          </w:p>
+        </w:tc>
+        <w:tc>
+          <w:tcPr>
+            <w:tcW w:type="dxa" w:w="1584"/>
+          </w:tcPr>
+          <w:p>
+            <w:r/>
+            <w:r>
+              <w:rPr>
+                <w:sz w:val="19"/>
+              </w:rPr>
+              <w:t>31.7%</w:t>
+            </w:r>
+          </w:p>
+        </w:tc>
+        <w:tc>
+          <w:tcPr>
+            <w:tcW w:type="dxa" w:w="2592"/>
+          </w:tcPr>
+          <w:p>
+            <w:r/>
+            <w:r>
+              <w:rPr>
+                <w:sz w:val="19"/>
+              </w:rPr>
+              <w:t>6%, 3-yr amort.; J. Bullard PG; subordinate to SBA</w:t>
             </w:r>
           </w:p>
         </w:tc>
@@ -224,7 +282,7 @@
               <w:rPr>
                 <w:sz w:val="19"/>
               </w:rPr>
-              <w:t>26.0%</w:t>
+              <w:t>20.6%</w:t>
             </w:r>
           </w:p>
         </w:tc>
@@ -238,7 +296,7 @@
               <w:rPr>
                 <w:sz w:val="19"/>
               </w:rPr>
-              <w:t>Qualifying equity injection</w:t>
+              <w:t>$180,000 SBA equity injection + $15,000 working capital</w:t>
             </w:r>
           </w:p>
         </w:tc>
@@ -268,7 +326,7 @@
               <w:rPr>
                 <w:sz w:val="19"/>
               </w:rPr>
-              <w:t>$750,000</w:t>
+              <w:t>$945,000</w:t>
             </w:r>
           </w:p>
         </w:tc>
@@ -296,7 +354,7 @@
               <w:rPr>
                 <w:sz w:val="19"/>
               </w:rPr>
-              <w:t>Seller paid in full at close (no retained note)</w:t>
+              <w:t>Dual-debt (SBA + subordinate bank loan)</w:t>
             </w:r>
           </w:p>
         </w:tc>
@@ -309,7 +367,7 @@
           <w:color w:val="1F3864"/>
           <w:sz w:val="23"/>
         </w:rPr>
-        <w:t>1. The injection is 2.6x the 10% minimum</w:t>
+        <w:t>1. The injection clears the 10% minimum</w:t>
       </w:r>
     </w:p>
     <w:p>
@@ -319,7 +377,7 @@
           <w:i w:val="0"/>
           <w:sz w:val="21"/>
         </w:rPr>
-        <w:t>SOP 50 10 8 requires a minimum equity injection of at least 10% of total project cost for a startup / complete change of ownership - here, $75,000. The transaction injects $195,000 of cash equity (26.0% of project cost), comfortably above the 10% floor, though below the ~30% down some startup a startup. The injection is non-borrowed cash, verified by the investor's bank / brokerage statements and the capital-contribution wire into the company's account, with funds seasoned in the contributor's account (lender to retain 30+ days of statements per the SOP verification standard).</w:t>
+        <w:t>SOP 50 10 8 requires a minimum equity injection of at least 10% of total project cost for a startup / complete change of ownership. The transaction injects $195,000 of cash equity (20.6% of the $945,000 project), of which $180,000 is designated as the SBA equity injection and $15,000 is additional working capital - comfortably above the 10% floor. The injection is non-borrowed cash, verified by the investor's bank / brokerage statements and the capital-contribution wire into the company's account, with funds seasoned in the contributor's account (lender to retain 30+ days of statements per the SOP verification standard).</w:t>
       </w:r>
     </w:p>
     <w:p>
@@ -674,7 +732,7 @@
           <w:color w:val="1F3864"/>
           <w:sz w:val="23"/>
         </w:rPr>
-        <w:t>2. Seller paid in full at close - no retained note</w:t>
+        <w:t>2. Acquisition financed by a subordinate bank loan (piggyback financing)</w:t>
       </w:r>
     </w:p>
     <w:p>
@@ -684,7 +742,7 @@
           <w:i w:val="0"/>
           <w:sz w:val="21"/>
         </w:rPr>
-        <w:t>The $300,000 acquisition price is paid in full at close from SBA proceeds and the equity injection. There is no retained seller note, so the SBA loan is the only debt the business carries and Year-1 debt service is the SBA loan alone (~$93,637/yr). This produces strong coverage from Year 1 (DSCR ~3.23x) rather than the compressed coverage of a dual-debt (SBA + seller note) structure.</w:t>
+        <w:t>The $300,000 Hickory acquisition is financed by a separate 3-year bank acquisition term loan (6%) from a bank the investor uses, personally guaranteed by James Bullard and subordinate to the SBA 7(a) loan. An intercreditor / subordination agreement and SBA-lender approval are required for this piggyback structure. Combined debt service in Years 1-3 is ~$169,211/yr (SBA $59,692 + bank $109,519), covered at 1.79x in Year 1 and rising to 4.02x and 5.95x (global 3.92x) as census ramps. After Year 3 the bank loan is fully amortized and only the SBA loan remains (~$59,692/yr).</w:t>
       </w:r>
     </w:p>
     <w:p>
@@ -694,7 +752,7 @@
           <w:color w:val="1F3864"/>
           <w:sz w:val="23"/>
         </w:rPr>
-        <w:t>3. The investor's equity qualifies without a personal guaranty</w:t>
+        <w:t>3. The investor's equity qualifies without an SBA personal guaranty</w:t>
       </w:r>
     </w:p>
     <w:p>
@@ -725,6 +783,16 @@
           <w:sz w:val="23"/>
         </w:rPr>
         <w:t>4. Guaranty and disclosure summary</w:t>
+      </w:r>
+    </w:p>
+    <w:p>
+      <w:r>
+        <w:rPr>
+          <w:b w:val="0"/>
+          <w:i/>
+          <w:sz w:val="19"/>
+        </w:rPr>
+        <w:t>SBA 7(a) loan guarantors: Geoff Schackmann (personal guaranty, controlling Manager); Adeline &amp; Lilah, LLC (entity guaranty, 39.9% owner of the borrower); and Hickory Hospice LLC (corporate guaranty plus a lien on its assets and receivables, as the operating subsidiary). Bullard does NOT guarantee the SBA loan; he guarantees only the separate bank acquisition loan.</w:t>
       </w:r>
     </w:p>
     <w:tbl>
@@ -797,7 +865,7 @@
                 <w:b/>
                 <w:sz w:val="19"/>
               </w:rPr>
-              <w:t>Personal guaranty / PFS / Form 912</w:t>
+              <w:t>Guaranty / PFS / Form 912</w:t>
             </w:r>
           </w:p>
         </w:tc>
@@ -855,7 +923,7 @@
               <w:rPr>
                 <w:sz w:val="19"/>
               </w:rPr>
-              <w:t>Entity disclosed</w:t>
+              <w:t>Entity guaranty of the SBA loan</w:t>
             </w:r>
           </w:p>
         </w:tc>
@@ -913,7 +981,7 @@
               <w:rPr>
                 <w:sz w:val="19"/>
               </w:rPr>
-              <w:t>Required - provided as the sole 20%+ controlling owner</w:t>
+              <w:t>Personal guaranty of the SBA loan - sole 20%+ controlling owner</w:t>
             </w:r>
           </w:p>
         </w:tc>
@@ -987,6 +1055,64 @@
               <w:rPr>
                 <w:sz w:val="19"/>
               </w:rPr>
+              <w:t>Hickory Hospice LLC (operating subsidiary)</w:t>
+            </w:r>
+          </w:p>
+        </w:tc>
+        <w:tc>
+          <w:tcPr>
+            <w:tcW w:type="dxa" w:w="2304"/>
+          </w:tcPr>
+          <w:p>
+            <w:r/>
+            <w:r>
+              <w:rPr>
+                <w:sz w:val="19"/>
+              </w:rPr>
+              <w:t>100% owned by borrower</w:t>
+            </w:r>
+          </w:p>
+        </w:tc>
+        <w:tc>
+          <w:tcPr>
+            <w:tcW w:type="dxa" w:w="1152"/>
+          </w:tcPr>
+          <w:p>
+            <w:r/>
+            <w:r>
+              <w:rPr>
+                <w:sz w:val="19"/>
+              </w:rPr>
+              <w:t>n/a</w:t>
+            </w:r>
+          </w:p>
+        </w:tc>
+        <w:tc>
+          <w:tcPr>
+            <w:tcW w:type="dxa" w:w="2880"/>
+          </w:tcPr>
+          <w:p>
+            <w:r/>
+            <w:r>
+              <w:rPr>
+                <w:sz w:val="19"/>
+              </w:rPr>
+              <w:t>Corporate guaranty + lien on assets / receivables</w:t>
+            </w:r>
+          </w:p>
+        </w:tc>
+      </w:tr>
+      <w:tr>
+        <w:tc>
+          <w:tcPr>
+            <w:tcW w:type="dxa" w:w="4032"/>
+          </w:tcPr>
+          <w:p>
+            <w:r/>
+            <w:r>
+              <w:rPr>
+                <w:sz w:val="19"/>
+              </w:rPr>
               <w:t>James Bullard (passive investor, direct)</w:t>
             </w:r>
           </w:p>
@@ -1029,7 +1155,7 @@
               <w:rPr>
                 <w:sz w:val="19"/>
               </w:rPr>
-              <w:t>Not required (source-of-funds verification only)</w:t>
+              <w:t>No SBA guaranty (guarantees only the bank acquisition loan); source-of-funds verification only</w:t>
             </w:r>
           </w:p>
         </w:tc>

</xml_diff>